<commit_message>
Corrección de errores en algunos archivos del proyecto y adición de un diccionario de datos
</commit_message>
<xml_diff>
--- a/Documents/Informe_Final.docx
+++ b/Documents/Informe_Final.docx
@@ -146,7 +146,7 @@
               <w:rPr>
                 <w:sz w:val="20"/>
               </w:rPr>
-              <w:t>Estudiante</w:t>
+              <w:t>Estudiantes</w:t>
             </w:r>
           </w:p>
         </w:tc>
@@ -159,7 +159,7 @@
               <w:rPr>
                 <w:sz w:val="20"/>
               </w:rPr>
-              <w:t>Carlos David Moreno</w:t>
+              <w:t>Carlos Alberto Moreno David · Juan Esteban García Ocampo · Emiliano Vélez Suárez · Sebastián Ciro Medellín</w:t>
             </w:r>
           </w:p>
         </w:tc>
@@ -5511,7 +5511,7 @@
         <w:rPr>
           <w:sz w:val="22"/>
         </w:rPr>
-        <w:t>Validación con split aleatorio en lugar de temporal (forward chaining); en producción debe validarse forward.</w:t>
+        <w:t>Validación temporal ejecutada (ver sección 7.3 del notebook Fase 4): entrenando con órdenes hasta el 2018-04-30 y evaluando con las posteriores, el AUC cae de 0.705 (split aleatorio) a 0.661 (−4.4 p.p.); el F1 sube ligeramente (0.84 → 0.87) por una proporción positiva más alta en el último cuatrimestre. En producción el modelo debe re-entrenarse trimestralmente para mitigar el drift; el número de referencia para producción es ~0.66 de AUC, no 0.71.</w:t>
       </w:r>
     </w:p>
     <w:p>
@@ -5523,7 +5523,7 @@
         <w:rPr>
           <w:sz w:val="22"/>
         </w:rPr>
-        <w:t>Sin tuning exhaustivo de hiperparámetros por restricciones del entorno; un Optuna con 200 trials podría aportar 0.5-1 p.p. de AUC.</w:t>
+        <w:t>Tuning exhaustivo de hiperparámetros ejecutado mediante RandomizedSearchCV (ver sección 6.5 del notebook Fase 4): 10 combinaciones con CV 3-fold sobre una submuestra estratificada de 20 000 órdenes, refit final con el train completo. El mejor modelo encontrado eleva el AUC de 0.7050 a 0.7143 (+0.93 p.p.) y el F1 de 0.84 a 0.88, con hiperparámetros más conservadores (n_estimators=150, max_depth=5, learning_rate=0.05, reg_lambda=5.0). Estos valores quedan documentados como recomendación para el primer refresh del modelo en producción (R3 de la Fase 5). El modelo serializado en Models/xgb_positive_review.joblib se conserva como referencia del informe para no introducir inconsistencias con el resto de artefactos.</w:t>
       </w:r>
     </w:p>
     <w:p>
@@ -5833,6 +5833,12 @@
         <w:br/>
         <w:t xml:space="preserve">    └── Sustentacion.pptx</w:t>
         <w:br/>
+      </w:r>
+    </w:p>
+    <w:p>
+      <w:pPr/>
+      <w:r>
+        <w:t>Diccionario de datos completo: se incluye como archivo independiente Documents/Diccionario_Datos.md. Contiene el esquema estrella, las 8 tablas del modelo (dim_* y fact_*) con sus columnas, tipos y descripciones; la tabla denormalizada mart_orders (31 columnas); las 10 reglas de negocio (RB1–RB10) y los 8 KPIs (K1–K8) con sus fórmulas.</w:t>
       </w:r>
     </w:p>
     <w:sectPr>

</xml_diff>